<commit_message>
improve report and code quality
</commit_message>
<xml_diff>
--- a/inst/templates/report_template.docx
+++ b/inst/templates/report_template.docx
@@ -705,6 +705,11 @@
   <w:style w:type="paragraph" w:default="1" w:styleId="Normal">
     <w:name w:val="Normal"/>
     <w:qFormat/>
+    <w:rPr xmlns:w="http://schemas.openxmlformats.org/wordprocessingml/2006/main">
+      <w:rFonts w:ascii="Adobe Garamond Pro" w:hAnsi="Adobe Garamond Pro" w:cs="Adobe Garamond Pro"/>
+      <w:sz w:val="22"/>
+      <w:szCs w:val="22"/>
+    </w:rPr>
   </w:style>
   <w:style w:type="paragraph" w:styleId="Titre1">
     <w:name w:val="heading 1"/>
@@ -717,9 +722,6 @@
     <w:pPr>
       <w:keepNext/>
       <w:keepLines/>
-      <w:numPr>
-        <w:numId w:val="3"/>
-      </w:numPr>
       <w:pBdr>
         <w:bottom w:val="single" w:sz="4" w:space="1" w:color="auto"/>
       </w:pBdr>
@@ -727,7 +729,7 @@
       <w:outlineLvl w:val="0"/>
     </w:pPr>
     <w:rPr>
-      <w:rFonts w:asciiTheme="majorHAnsi" w:eastAsiaTheme="majorEastAsia" w:hAnsiTheme="majorHAnsi" w:cstheme="majorBidi"/>
+      <w:rFonts xmlns:w="http://schemas.openxmlformats.org/wordprocessingml/2006/main" w:ascii="Adobe Garamond Pro" w:hAnsi="Adobe Garamond Pro" w:cs="Adobe Garamond Pro"/>
       <w:b/>
       <w:bCs/>
       <w:sz w:val="32"/>
@@ -747,15 +749,11 @@
     <w:pPr>
       <w:keepNext/>
       <w:keepLines/>
-      <w:numPr>
-        <w:ilvl w:val="1"/>
-        <w:numId w:val="3"/>
-      </w:numPr>
       <w:spacing w:before="200"/>
       <w:outlineLvl w:val="1"/>
     </w:pPr>
     <w:rPr>
-      <w:rFonts w:asciiTheme="majorHAnsi" w:eastAsiaTheme="majorEastAsia" w:hAnsiTheme="majorHAnsi" w:cstheme="majorBidi"/>
+      <w:rFonts xmlns:w="http://schemas.openxmlformats.org/wordprocessingml/2006/main" w:ascii="Adobe Garamond Pro" w:hAnsi="Adobe Garamond Pro" w:cs="Adobe Garamond Pro"/>
       <w:b/>
       <w:bCs/>
       <w:sz w:val="26"/>
@@ -775,15 +773,11 @@
     <w:pPr>
       <w:keepNext/>
       <w:keepLines/>
-      <w:numPr>
-        <w:ilvl w:val="2"/>
-        <w:numId w:val="3"/>
-      </w:numPr>
       <w:spacing w:before="200"/>
       <w:outlineLvl w:val="2"/>
     </w:pPr>
     <w:rPr>
-      <w:rFonts w:asciiTheme="majorHAnsi" w:eastAsiaTheme="majorEastAsia" w:hAnsiTheme="majorHAnsi" w:cstheme="majorBidi"/>
+      <w:rFonts xmlns:w="http://schemas.openxmlformats.org/wordprocessingml/2006/main" w:ascii="Adobe Garamond Pro" w:hAnsi="Adobe Garamond Pro" w:cs="Adobe Garamond Pro"/>
       <w:b/>
       <w:bCs/>
     </w:rPr>
@@ -1166,7 +1160,7 @@
     </a:clrScheme>
     <a:fontScheme name="Bureau">
       <a:majorFont>
-        <a:latin typeface="Calibri"/>
+        <a:latin typeface="Adobe Garamond Pro"/>
         <a:ea typeface=""/>
         <a:cs typeface=""/>
         <a:font script="Jpan" typeface="ＭＳ ゴシック"/>
@@ -1201,7 +1195,7 @@
         <a:font script="Geor" typeface="Sylfaen"/>
       </a:majorFont>
       <a:minorFont>
-        <a:latin typeface="Cambria"/>
+        <a:latin typeface="Adobe Garamond Pro"/>
         <a:ea typeface=""/>
         <a:cs typeface=""/>
         <a:font script="Jpan" typeface="ＭＳ 明朝"/>

</xml_diff>